<commit_message>
IGCSE Date issue fix
</commit_message>
<xml_diff>
--- a/raw-document/resume.docx
+++ b/raw-document/resume.docx
@@ -125,14 +125,7 @@
                 <w:rFonts w:ascii="Garamond" w:hAnsi="Garamond"/>
                 <w:color w:val="666666"/>
               </w:rPr>
-              <w:t xml:space="preserve">Location: </w:t>
-            </w:r>
-            <w:r>
-              <w:rPr>
-                <w:rFonts w:ascii="Garamond" w:hAnsi="Garamond"/>
-                <w:color w:val="666666"/>
-              </w:rPr>
-              <w:t>Selangor, Malaysia</w:t>
+              <w:t>Location: Selangor, Malaysia</w:t>
             </w:r>
           </w:p>
           <w:p>
@@ -149,14 +142,7 @@
                 <w:rFonts w:ascii="Garamond" w:hAnsi="Garamond"/>
                 <w:color w:val="666666"/>
               </w:rPr>
-              <w:t xml:space="preserve">Date of birth: </w:t>
-            </w:r>
-            <w:r>
-              <w:rPr>
-                <w:rFonts w:ascii="Garamond" w:hAnsi="Garamond"/>
-                <w:color w:val="666666"/>
-              </w:rPr>
-              <w:t>01-01-2008</w:t>
+              <w:t>Date of birth: 01-01-2008</w:t>
             </w:r>
           </w:p>
         </w:tc>
@@ -193,14 +179,7 @@
                 <w:rFonts w:ascii="Garamond" w:hAnsi="Garamond"/>
                 <w:color w:val="666666"/>
               </w:rPr>
-              <w:t>Number: +</w:t>
-            </w:r>
-            <w:r>
-              <w:rPr>
-                <w:rFonts w:ascii="Garamond" w:hAnsi="Garamond"/>
-                <w:color w:val="666666"/>
-              </w:rPr>
-              <w:t>601121194948</w:t>
+              <w:t>Number: +601121194948</w:t>
             </w:r>
           </w:p>
           <w:p>
@@ -257,23 +236,7 @@
                   <w:rFonts w:ascii="Garamond" w:hAnsi="Garamond"/>
                   <w:color w:val="666666"/>
                 </w:rPr>
-                <w:t>Linkedin.com/in/</w:t>
-              </w:r>
-              <w:proofErr w:type="spellStart"/>
-              <w:r>
-                <w:rPr>
-                  <w:rFonts w:ascii="Garamond" w:hAnsi="Garamond"/>
-                  <w:color w:val="666666"/>
-                </w:rPr>
-                <w:t>darkguyaiman</w:t>
-              </w:r>
-              <w:proofErr w:type="spellEnd"/>
-              <w:r>
-                <w:rPr>
-                  <w:rFonts w:ascii="Garamond" w:hAnsi="Garamond"/>
-                  <w:color w:val="666666"/>
-                </w:rPr>
-                <w:t>/</w:t>
+                <w:t>Linkedin.com/in/darkguyaiman/</w:t>
               </w:r>
             </w:hyperlink>
           </w:p>
@@ -292,14 +255,7 @@
                   <w:rFonts w:ascii="Garamond" w:hAnsi="Garamond"/>
                   <w:color w:val="666666"/>
                 </w:rPr>
-                <w:t>Darkguyaiman.com</w:t>
-              </w:r>
-              <w:r>
-                <w:rPr>
-                  <w:rFonts w:ascii="Garamond" w:hAnsi="Garamond"/>
-                  <w:color w:val="666666"/>
-                </w:rPr>
-                <w:t xml:space="preserve"> (my portfolio)</w:t>
+                <w:t>Darkguyaiman.com (my portfolio)</w:t>
               </w:r>
             </w:hyperlink>
           </w:p>
@@ -369,7 +325,43 @@
         <w:rPr>
           <w:i/>
         </w:rPr>
-        <w:t>January 2019 - January 2022 | 7 subjects: 4 A* and 3 A grades</w:t>
+        <w:t>January 20</w:t>
+      </w:r>
+      <w:r>
+        <w:rPr>
+          <w:i/>
+        </w:rPr>
+        <w:t>21</w:t>
+      </w:r>
+      <w:r>
+        <w:rPr>
+          <w:i/>
+        </w:rPr>
+        <w:t xml:space="preserve"> - </w:t>
+      </w:r>
+      <w:r>
+        <w:rPr>
+          <w:i/>
+        </w:rPr>
+        <w:t>October</w:t>
+      </w:r>
+      <w:r>
+        <w:rPr>
+          <w:i/>
+        </w:rPr>
+        <w:t xml:space="preserve"> 202</w:t>
+      </w:r>
+      <w:r>
+        <w:rPr>
+          <w:i/>
+        </w:rPr>
+        <w:t>4</w:t>
+      </w:r>
+      <w:r>
+        <w:rPr>
+          <w:i/>
+        </w:rPr>
+        <w:t xml:space="preserve"> | 7 subjects: 4 A* and 3 A grades</w:t>
       </w:r>
     </w:p>
     <w:p>
@@ -717,13 +709,8 @@
         <w:pStyle w:val="Heading2"/>
       </w:pPr>
       <w:r>
-        <w:t xml:space="preserve">Team Leader | </w:t>
+        <w:t>Team Leader | Fussional</w:t>
       </w:r>
-      <w:proofErr w:type="spellStart"/>
-      <w:r>
-        <w:t>Fussional</w:t>
-      </w:r>
-      <w:proofErr w:type="spellEnd"/>
     </w:p>
     <w:p>
       <w:pPr>

</xml_diff>